<commit_message>
updated Fuzz Testing - Create Test Procedure tertiary document (added test replay / test output topics to the considerations section)
</commit_message>
<xml_diff>
--- a/source/reference_documents/tertiary_documents/implementation/Fuzz Testing/create test/Fuzz Testing - Create Test.docx
+++ b/source/reference_documents/tertiary_documents/implementation/Fuzz Testing/create test/Fuzz Testing - Create Test.docx
@@ -40,7 +40,7 @@
         <w:t xml:space="preserve">Version </w:t>
       </w:r>
       <w:r>
-        <w:t>2</w:t>
+        <w:t>3</w:t>
       </w:r>
     </w:p>
     <w:p>
@@ -57,7 +57,7 @@
         <w:rPr>
           <w:noProof/>
         </w:rPr>
-        <w:t>6/3/26 1:42 PM</w:t>
+        <w:t>6/29/26 10:11 AM</w:t>
       </w:r>
       <w:r>
         <w:fldChar w:fldCharType="end"/>
@@ -1043,13 +1043,7 @@
         <w:t xml:space="preserve">It is required that the </w:t>
       </w:r>
       <w:r>
-        <w:t xml:space="preserve">build file has been updated </w:t>
-      </w:r>
-      <w:r>
-        <w:t xml:space="preserve">to make the appropriate fuzz testing frameworks available for use with the element under consideration </w:t>
-      </w:r>
-      <w:r>
-        <w:t>as a result of the fuzz testing settings establishment activity</w:t>
+        <w:t>build file has been updated to make the appropriate fuzz testing frameworks available for use with the element under consideration as a result of the fuzz testing settings establishment activity</w:t>
       </w:r>
       <w:r>
         <w:t>.</w:t>
@@ -1564,10 +1558,7 @@
         <w:tab/>
       </w:r>
       <w:r>
-        <w:t xml:space="preserve">It is </w:t>
-      </w:r>
-      <w:r>
-        <w:t xml:space="preserve">presumed that all considerations presented in the </w:t>
+        <w:t xml:space="preserve">It is presumed that all considerations presented in the </w:t>
       </w:r>
       <w:r>
         <w:rPr>
@@ -1587,10 +1578,7 @@
         <w:t>Fuzz Testing – Establish Settings</w:t>
       </w:r>
       <w:r>
-        <w:t xml:space="preserve"> procedure apply here also</w:t>
-      </w:r>
-      <w:r>
-        <w:t>.</w:t>
+        <w:t xml:space="preserve"> procedure apply here also.</w:t>
       </w:r>
     </w:p>
     <w:p>
@@ -1947,6 +1935,130 @@
       </w:r>
       <w:r>
         <w:t>The specifics of automation are outside the scope of this document.</w:t>
+      </w:r>
+    </w:p>
+    <w:p>
+      <w:pPr>
+        <w:pStyle w:val="Heading2"/>
+      </w:pPr>
+      <w:r>
+        <w:t xml:space="preserve">Test </w:t>
+      </w:r>
+      <w:r>
+        <w:t>Replay</w:t>
+      </w:r>
+    </w:p>
+    <w:p>
+      <w:r>
+        <w:t>When the fuzz testing framework provide support for replaying issue-generating inputs, it is recommended to</w:t>
+      </w:r>
+      <w:r>
+        <w:t xml:space="preserve"> take advantage of this capability</w:t>
+      </w:r>
+      <w:r>
+        <w:t>.</w:t>
+      </w:r>
+    </w:p>
+    <w:p>
+      <w:r>
+        <w:t>This support produces outputs which can be used either by developers or orchestration software.</w:t>
+      </w:r>
+    </w:p>
+    <w:p>
+      <w:pPr>
+        <w:pStyle w:val="Note"/>
+      </w:pPr>
+      <w:r>
+        <w:rPr>
+          <w:b/>
+          <w:bCs/>
+          <w:color w:val="0070C0"/>
+        </w:rPr>
+        <w:t>Note:</w:t>
+      </w:r>
+      <w:r>
+        <w:tab/>
+      </w:r>
+      <w:r>
+        <w:t>Keep in mind the impact this will have on the testing footprint</w:t>
+      </w:r>
+      <w:r>
+        <w:t>.</w:t>
+      </w:r>
+    </w:p>
+    <w:p>
+      <w:pPr>
+        <w:pStyle w:val="Note"/>
+      </w:pPr>
+      <w:r>
+        <w:rPr>
+          <w:b/>
+          <w:bCs/>
+          <w:color w:val="0070C0"/>
+        </w:rPr>
+        <w:t>Note:</w:t>
+      </w:r>
+      <w:r>
+        <w:tab/>
+      </w:r>
+      <w:r>
+        <w:t>The discussion of orchestration software is outside the scope of the AVCDL</w:t>
+      </w:r>
+      <w:r>
+        <w:t>.</w:t>
+      </w:r>
+    </w:p>
+    <w:p>
+      <w:pPr>
+        <w:pStyle w:val="Heading2"/>
+      </w:pPr>
+      <w:r>
+        <w:t>Test Output</w:t>
+      </w:r>
+    </w:p>
+    <w:p>
+      <w:r>
+        <w:t xml:space="preserve">When creating a fuzz test it is important to </w:t>
+      </w:r>
+      <w:r>
+        <w:t>not neglect</w:t>
+      </w:r>
+      <w:r>
+        <w:t xml:space="preserve"> the output generated when the test runs</w:t>
+      </w:r>
+      <w:r>
+        <w:t>.</w:t>
+      </w:r>
+      <w:r>
+        <w:t xml:space="preserve"> Since the goal of fuzz testing is to identify deficiencies in the code, test should be constructed </w:t>
+      </w:r>
+      <w:r>
+        <w:t>in</w:t>
+      </w:r>
+      <w:r>
+        <w:t xml:space="preserve"> such a way as to produce output that will allow for a developer to replicate and resolve the issue.</w:t>
+      </w:r>
+    </w:p>
+    <w:p>
+      <w:pPr>
+        <w:pStyle w:val="Note"/>
+      </w:pPr>
+      <w:r>
+        <w:rPr>
+          <w:b/>
+          <w:bCs/>
+          <w:color w:val="0070C0"/>
+        </w:rPr>
+        <w:t>Note:</w:t>
+      </w:r>
+      <w:r>
+        <w:tab/>
+      </w:r>
+      <w:r>
+        <w:t>The above holds regardless of the specific embodiment of the fuzz testing output</w:t>
+      </w:r>
+      <w:r>
+        <w:t>.</w:t>
       </w:r>
     </w:p>
     <w:p>

</xml_diff>